<commit_message>
Porta l'analisi su identita' e IAM alla v0.4
Nuove sorgenti nella cartella «Interazione IAM»: il manuale di integrazione
applicativa dell'IAM di Roma Capitale, la comunicazione sul provider SSO,
il manuale operativo RDE/COEC e le due note sul processo di autenticazione
di sipo-auth.

La v0.4 verifica la congruenza con queste fonti e aggiunge il capitolo
«Scelte effettuate». Verifiche fatte sulle fonti, non riprese dalle analisi
del fornitore: «management» non e' un servizio di IAM (PI-05 si chiude) e i
claim di persona giuridica, delega e assistito non esistono nel contratto.

Co-Authored-By: Claude Opus 5 (1M context) <noreply@anthropic.com>
</commit_message>
<xml_diff>
--- a/Documenti finali/ANALISI_Identita-Profilazione-IAM_v0.3.docx
+++ b/Documenti finali/ANALISI_Identita-Profilazione-IAM_v0.3.docx
@@ -4365,7 +4365,19 @@
         <w:rPr>
           <w:lang w:val="it-IT"/>
         </w:rPr>
-        <w:t xml:space="preserve"> con l’adozione del servizio di gestione delle identità di Roma Capitale. Tiene insieme le due cose di proposito: un accesso robusto davanti a servizi che rispondono senza gettone non migliora la sicurezza complessiva, e separare lo stato di fatto dal piano di intervento avrebbe nascosto proprio questo.</w:t>
+        <w:t xml:space="preserve"> con l’adozione del servizio di gestione delle identità di Roma Capitale. Tiene insieme le due cose di proposito: un accesso robusto davanti a servizi che rispondono senza </w:t>
+      </w:r>
+      <w:r>
+        <w:rPr>
+          <w:lang w:val="it-IT"/>
+        </w:rPr>
+        <w:t>token</w:t>
+      </w:r>
+      <w:r>
+        <w:rPr>
+          <w:lang w:val="it-IT"/>
+        </w:rPr>
+        <w:t xml:space="preserve"> non migliora la sicurezza complessiva, e separare lo stato di fatto dal piano di intervento avrebbe nascosto proprio questo.</w:t>
       </w:r>
     </w:p>
     <w:p>
@@ -4764,7 +4776,21 @@
                 <w:sz w:val="17"/>
                 <w:lang w:val="it-IT"/>
               </w:rPr>
-              <w:t>La modalità in cui l’identità è provata da un gettone firmato, ottenuto con un reindirizzamento e uno scambio fuori banda.</w:t>
+              <w:t xml:space="preserve">La modalità in cui l’identità è provata da un </w:t>
+            </w:r>
+            <w:r>
+              <w:rPr>
+                <w:sz w:val="17"/>
+                <w:lang w:val="it-IT"/>
+              </w:rPr>
+              <w:t>token</w:t>
+            </w:r>
+            <w:r>
+              <w:rPr>
+                <w:sz w:val="17"/>
+                <w:lang w:val="it-IT"/>
+              </w:rPr>
+              <w:t xml:space="preserve"> firmato, ottenuto con un reindirizzamento e uno scambio fuori banda.</w:t>
             </w:r>
           </w:p>
         </w:tc>
@@ -5683,7 +5709,19 @@
         <w:rPr>
           <w:lang w:val="it-IT"/>
         </w:rPr>
-        <w:t xml:space="preserve">. Il primo è la persona, e vive soltanto nei front-end: arriva dal portale sotto forma di intestazioni HTTP, viene arricchita con i profili letti dalla base dati anagrafica e deposta in sessione. Il secondo è l’identità tecnica verso i back-end: a ogni chiamata il front-end ottiene un gettone presentando </w:t>
+        <w:t xml:space="preserve">. Il primo è la persona, e vive soltanto nei front-end: arriva dal portale sotto forma di intestazioni HTTP, viene arricchita con i profili letti dalla base dati anagrafica e deposta in sessione. Il secondo è l’identità tecnica verso i back-end: a ogni chiamata il front-end ottiene un </w:t>
+      </w:r>
+      <w:r>
+        <w:rPr>
+          <w:lang w:val="it-IT"/>
+        </w:rPr>
+        <w:t>token</w:t>
+      </w:r>
+      <w:r>
+        <w:rPr>
+          <w:lang w:val="it-IT"/>
+        </w:rPr>
+        <w:t xml:space="preserve"> presentando </w:t>
       </w:r>
       <w:r>
         <w:rPr>
@@ -5718,7 +5756,19 @@
         <w:rPr>
           <w:lang w:val="it-IT"/>
         </w:rPr>
-        <w:t xml:space="preserve"> Nel gettone che raggiunge i servizi il soggetto è «amministratore» o «utente autorizzato», mai il codice fiscale di chi sta lavorando. Chi è davvero l’operatore viaggia nel corpo della richiesta, come un dato qualunque, e nessuno lo verifica. È la radice di buona parte dei rilievi della prima parte.</w:t>
+        <w:t xml:space="preserve"> Nel </w:t>
+      </w:r>
+      <w:r>
+        <w:rPr>
+          <w:lang w:val="it-IT"/>
+        </w:rPr>
+        <w:t>token</w:t>
+      </w:r>
+      <w:r>
+        <w:rPr>
+          <w:lang w:val="it-IT"/>
+        </w:rPr>
+        <w:t xml:space="preserve"> che raggiunge i servizi il soggetto è «amministratore» o «utente autorizzato», mai il codice fiscale di chi sta lavorando. Chi è davvero l’operatore viaggia nel corpo della richiesta, come un dato qualunque, e nessuno lo verifica. È la radice di buona parte dei rilievi della prima parte.</w:t>
       </w:r>
     </w:p>
     <w:p>
@@ -5759,7 +5809,19 @@
         <w:rPr>
           <w:lang w:val="it-IT"/>
         </w:rPr>
-        <w:t xml:space="preserve">. Le intestazioni «iv-» non sono un arrangiamento proprietario ma la modalità header prevista dal capitolo 3.2 della specifica dell’ente [F4]. Passare al flusso con gettone firmato significa </w:t>
+        <w:t xml:space="preserve">. Le intestazioni «iv-» non sono un arrangiamento proprietario ma la modalità header prevista dal capitolo 3.2 della specifica dell’ente [F4]. Passare al flusso con </w:t>
+      </w:r>
+      <w:r>
+        <w:rPr>
+          <w:lang w:val="it-IT"/>
+        </w:rPr>
+        <w:t>token</w:t>
+      </w:r>
+      <w:r>
+        <w:rPr>
+          <w:lang w:val="it-IT"/>
+        </w:rPr>
+        <w:t xml:space="preserve"> firmato significa </w:t>
       </w:r>
       <w:r>
         <w:rPr>
@@ -7902,7 +7964,14 @@
                 <w:sz w:val="17"/>
                 <w:lang w:val="it-IT"/>
               </w:rPr>
-              <w:t>I servizi di back-end rispondono senza gettone</w:t>
+              <w:t xml:space="preserve">I servizi di back-end rispondono senza </w:t>
+            </w:r>
+            <w:r>
+              <w:rPr>
+                <w:sz w:val="17"/>
+                <w:lang w:val="it-IT"/>
+              </w:rPr>
+              <w:t>token</w:t>
             </w:r>
           </w:p>
         </w:tc>
@@ -8085,7 +8154,21 @@
                 <w:sz w:val="17"/>
                 <w:lang w:val="it-IT"/>
               </w:rPr>
-              <w:t>Identificativo utente, organizzazione, codice fiscale e ruolo arrivano nel corpo della richiesta e il back-end li accetta senza verifica. Con un gettone qualsiasi — o senza, vedi RI-01 — si opera «come» un altro ufficiale o un’altra organizzazione. Il ruolo ricevuto decide perfino con quale utenza si chiama il canale ANPR.</w:t>
+              <w:t xml:space="preserve">Identificativo utente, organizzazione, codice fiscale e ruolo arrivano nel corpo della richiesta e il back-end li accetta senza verifica. Con un </w:t>
+            </w:r>
+            <w:r>
+              <w:rPr>
+                <w:sz w:val="17"/>
+                <w:lang w:val="it-IT"/>
+              </w:rPr>
+              <w:t>token</w:t>
+            </w:r>
+            <w:r>
+              <w:rPr>
+                <w:sz w:val="17"/>
+                <w:lang w:val="it-IT"/>
+              </w:rPr>
+              <w:t xml:space="preserve"> qualsiasi — o senza, vedi RI-01 — si opera «come» un altro ufficiale o un’altra organizzazione. Il ruolo ricevuto decide perfino con quale utenza si chiama il canale ANPR.</w:t>
             </w:r>
           </w:p>
         </w:tc>
@@ -8237,7 +8320,21 @@
                 <w:sz w:val="17"/>
                 <w:lang w:val="it-IT"/>
               </w:rPr>
-              <w:t xml:space="preserve"> nel codice. Chi conosce la chiave di firma può costruire un gettone con qualunque autorità, valido su tutti i back-end.</w:t>
+              <w:t xml:space="preserve"> nel codice. Chi conosce la chiave di firma può costruire un </w:t>
+            </w:r>
+            <w:r>
+              <w:rPr>
+                <w:sz w:val="17"/>
+                <w:lang w:val="it-IT"/>
+              </w:rPr>
+              <w:t>token</w:t>
+            </w:r>
+            <w:r>
+              <w:rPr>
+                <w:sz w:val="17"/>
+                <w:lang w:val="it-IT"/>
+              </w:rPr>
+              <w:t xml:space="preserve"> con qualunque autorità, valido su tutti i back-end.</w:t>
             </w:r>
           </w:p>
         </w:tc>
@@ -9899,7 +9996,21 @@
                 <w:sz w:val="17"/>
                 <w:lang w:val="it-IT"/>
               </w:rPr>
-              <w:t>Un gettone nuovo a ogni chiamata, e quarantaquattro emittenti</w:t>
+              <w:t xml:space="preserve">Un </w:t>
+            </w:r>
+            <w:r>
+              <w:rPr>
+                <w:sz w:val="17"/>
+                <w:lang w:val="it-IT"/>
+              </w:rPr>
+              <w:t>token</w:t>
+            </w:r>
+            <w:r>
+              <w:rPr>
+                <w:sz w:val="17"/>
+                <w:lang w:val="it-IT"/>
+              </w:rPr>
+              <w:t xml:space="preserve"> nuovo a ogni chiamata, e quarantaquattro emittenti</w:t>
             </w:r>
           </w:p>
         </w:tc>
@@ -9939,7 +10050,21 @@
                 <w:sz w:val="17"/>
                 <w:lang w:val="it-IT"/>
               </w:rPr>
-              <w:t>Il client richiede un gettone all’inizio di ogni metodo, senza alcuna conservazione: due viaggi per ogni chiamata. Ogni back-end è insieme server di autorizzazione e di risorsa: nessuna gestione centrale, e la revoca è impossibile perché i gettoni non hanno stato.</w:t>
+              <w:t xml:space="preserve">Il client richiede un </w:t>
+            </w:r>
+            <w:r>
+              <w:rPr>
+                <w:sz w:val="17"/>
+                <w:lang w:val="it-IT"/>
+              </w:rPr>
+              <w:t>token</w:t>
+            </w:r>
+            <w:r>
+              <w:rPr>
+                <w:sz w:val="17"/>
+                <w:lang w:val="it-IT"/>
+              </w:rPr>
+              <w:t xml:space="preserve"> all’inizio di ogni metodo, senza alcuna conservazione: due viaggi per ogni chiamata. Ogni back-end è insieme server di autorizzazione e di risorsa: nessuna gestione centrale, e la revoca è impossibile perché i gettoni non hanno stato.</w:t>
             </w:r>
           </w:p>
         </w:tc>
@@ -11321,7 +11446,19 @@
         <w:rPr>
           <w:lang w:val="it-IT"/>
         </w:rPr>
-        <w:t>Una conferma collaterale viene dai nuovi front-end. La libreria Angular condivisa [F7] rinvia, in assenza di gettone, a un indirizzo che contiene «</w:t>
+        <w:t xml:space="preserve">Una conferma collaterale viene dai nuovi front-end. La libreria Angular condivisa [F7] rinvia, in assenza di </w:t>
+      </w:r>
+      <w:r>
+        <w:rPr>
+          <w:lang w:val="it-IT"/>
+        </w:rPr>
+        <w:t>token</w:t>
+      </w:r>
+      <w:r>
+        <w:rPr>
+          <w:lang w:val="it-IT"/>
+        </w:rPr>
+        <w:t>, a un indirizzo che contiene «</w:t>
       </w:r>
       <w:proofErr w:type="spellStart"/>
       <w:r>
@@ -11458,7 +11595,19 @@
         <w:rPr>
           <w:lang w:val="it-IT"/>
         </w:rPr>
-        <w:t>. Si costruisce il punto di ingresso che genera i parametri di sicurezza e reindirizza; la callback che riceve il codice e ne verifica la corrispondenza; lo scambio fuori banda con la convalida completa del gettone; la lettura dei profili per codice fiscale; la mappatura sui campi dell’oggetto di sessione.</w:t>
+        <w:t xml:space="preserve">. Si costruisce il punto di ingresso che genera i parametri di sicurezza e reindirizza; la callback che riceve il codice e ne verifica la corrispondenza; lo scambio fuori banda con la convalida completa del </w:t>
+      </w:r>
+      <w:r>
+        <w:rPr>
+          <w:lang w:val="it-IT"/>
+        </w:rPr>
+        <w:t>token</w:t>
+      </w:r>
+      <w:r>
+        <w:rPr>
+          <w:lang w:val="it-IT"/>
+        </w:rPr>
+        <w:t>; la lettura dei profili per codice fiscale; la mappatura sui campi dell’oggetto di sessione.</w:t>
       </w:r>
     </w:p>
     <w:p>
@@ -12056,7 +12205,35 @@
                 <w:sz w:val="17"/>
                 <w:lang w:val="it-IT"/>
               </w:rPr>
-              <w:t>nessun cambiamento · un gettone SIPO per l’utente · inoltrare il gettone IAM</w:t>
+              <w:t xml:space="preserve">nessun cambiamento · un </w:t>
+            </w:r>
+            <w:r>
+              <w:rPr>
+                <w:sz w:val="17"/>
+                <w:lang w:val="it-IT"/>
+              </w:rPr>
+              <w:t>token</w:t>
+            </w:r>
+            <w:r>
+              <w:rPr>
+                <w:sz w:val="17"/>
+                <w:lang w:val="it-IT"/>
+              </w:rPr>
+              <w:t xml:space="preserve"> SIPO per l’utente · inoltrare il </w:t>
+            </w:r>
+            <w:r>
+              <w:rPr>
+                <w:sz w:val="17"/>
+                <w:lang w:val="it-IT"/>
+              </w:rPr>
+              <w:t>token</w:t>
+            </w:r>
+            <w:r>
+              <w:rPr>
+                <w:sz w:val="17"/>
+                <w:lang w:val="it-IT"/>
+              </w:rPr>
+              <w:t xml:space="preserve"> IAM</w:t>
             </w:r>
           </w:p>
         </w:tc>
@@ -12101,7 +12278,21 @@
                 <w:sz w:val="17"/>
                 <w:lang w:val="it-IT"/>
               </w:rPr>
-              <w:t xml:space="preserve"> Inoltrare il gettone dell’IAM è sconsigliato: il destinatario dichiarato è il client IAM e i back-end di SIPO non lo sono. </w:t>
+              <w:t xml:space="preserve"> Inoltrare il </w:t>
+            </w:r>
+            <w:r>
+              <w:rPr>
+                <w:sz w:val="17"/>
+                <w:lang w:val="it-IT"/>
+              </w:rPr>
+              <w:t>token</w:t>
+            </w:r>
+            <w:r>
+              <w:rPr>
+                <w:sz w:val="17"/>
+                <w:lang w:val="it-IT"/>
+              </w:rPr>
+              <w:t xml:space="preserve"> dell’IAM è sconsigliato: il destinatario dichiarato è il client IAM e i back-end di SIPO non lo sono. </w:t>
             </w:r>
           </w:p>
           <w:p>
@@ -12139,6 +12330,7 @@
                 <w:sz w:val="17"/>
                 <w:lang w:val="it-IT"/>
               </w:rPr>
+              <w:lastRenderedPageBreak/>
               <w:t>D5</w:t>
             </w:r>
           </w:p>
@@ -13408,7 +13600,21 @@
                 <w:sz w:val="18"/>
                 <w:lang w:val="it-IT"/>
               </w:rPr>
-              <w:t>Il gettone di IAM non è spendibile verso i back-end: il destinatario dichiarato è il client IAM. La decisione D4 resta intera, e con essa RI-02</w:t>
+              <w:t xml:space="preserve">Il </w:t>
+            </w:r>
+            <w:r>
+              <w:rPr>
+                <w:sz w:val="18"/>
+                <w:lang w:val="it-IT"/>
+              </w:rPr>
+              <w:t>token</w:t>
+            </w:r>
+            <w:r>
+              <w:rPr>
+                <w:sz w:val="18"/>
+                <w:lang w:val="it-IT"/>
+              </w:rPr>
+              <w:t xml:space="preserve"> di IAM non è spendibile verso i back-end: il destinatario dichiarato è il client IAM. La decisione D4 resta intera, e con essa RI-02</w:t>
             </w:r>
             <w:r>
               <w:rPr>
@@ -13717,7 +13923,22 @@
                 <w:sz w:val="18"/>
                 <w:lang w:val="it-IT"/>
               </w:rPr>
-              <w:t>Il suo gettone potrebbe diventare quello da propagare ai back-end, chiudendo anche la decisione D4 con lo stesso componente.</w:t>
+              <w:lastRenderedPageBreak/>
+              <w:t xml:space="preserve">Il suo </w:t>
+            </w:r>
+            <w:r>
+              <w:rPr>
+                <w:sz w:val="18"/>
+                <w:lang w:val="it-IT"/>
+              </w:rPr>
+              <w:t>token</w:t>
+            </w:r>
+            <w:r>
+              <w:rPr>
+                <w:sz w:val="18"/>
+                <w:lang w:val="it-IT"/>
+              </w:rPr>
+              <w:t xml:space="preserve"> potrebbe diventare quello da propagare ai back-end, chiudendo anche la decisione D4 con lo stesso componente.</w:t>
             </w:r>
           </w:p>
         </w:tc>
@@ -13838,7 +14059,19 @@
         <w:rPr>
           <w:lang w:val="it-IT"/>
         </w:rPr>
-        <w:t xml:space="preserve">Kubernetes: un componente in più, dentro o fuori dal cluster, con la propria alta affidabilità. Prima di valutarla servono tre risposte (PI-09): supporto all’IAM dell’ente, claim applicativi nel gettone, </w:t>
+        <w:t xml:space="preserve">Kubernetes: un componente in più, dentro o fuori dal cluster, con la propria alta affidabilità. Prima di valutarla servono tre risposte (PI-09): supporto all’IAM dell’ente, claim applicativi nel </w:t>
+      </w:r>
+      <w:r>
+        <w:rPr>
+          <w:lang w:val="it-IT"/>
+        </w:rPr>
+        <w:t>token</w:t>
+      </w:r>
+      <w:r>
+        <w:rPr>
+          <w:lang w:val="it-IT"/>
+        </w:rPr>
+        <w:t xml:space="preserve">, </w:t>
       </w:r>
       <w:proofErr w:type="spellStart"/>
       <w:r>
@@ -14212,11 +14445,38 @@
         <w:t>Un BFF — Backend For Frontend — è un componente lato server dedicato a un front-end, o a una famiglia di front-end, che si interpone fra il browser e i servizi.</w:t>
       </w:r>
       <w:r>
-        <w:t xml:space="preserve"> Il browser parla soltanto con lui; è lui a tenere la sessione, a custodire i gettoni e a chiamare i servizi a valle per conto dell’utente. Nasce per le applicazioni a pagina singola, dove l’alternativa è </w:t>
-      </w:r>
+        <w:t xml:space="preserve"> Il browser parla soltanto con lui; è lui a tenere la sessione, a custodire i gettoni e a chiamare i servizi a valle per conto dell’utente. Nasce per le applicazioni a pagina singola, dove </w:t>
+      </w:r>
+      <w:proofErr w:type="spellStart"/>
+      <w:r>
+        <w:t>l’alternativa</w:t>
+      </w:r>
+      <w:proofErr w:type="spellEnd"/>
+      <w:r>
+        <w:t xml:space="preserve"> è </w:t>
+      </w:r>
+      <w:proofErr w:type="spellStart"/>
       <w:r>
         <w:lastRenderedPageBreak/>
-        <w:t>tenere il gettone nel browser, ed è oggi il modo raccomandato di far dialogare una applicazione Angular con dei servizi protetti.</w:t>
+        <w:t>tenere</w:t>
+      </w:r>
+      <w:proofErr w:type="spellEnd"/>
+      <w:r>
+        <w:t xml:space="preserve"> il </w:t>
+      </w:r>
+      <w:r>
+        <w:t>token</w:t>
+      </w:r>
+      <w:r>
+        <w:t xml:space="preserve"> </w:t>
+      </w:r>
+      <w:proofErr w:type="spellStart"/>
+      <w:r>
+        <w:t>nel</w:t>
+      </w:r>
+      <w:proofErr w:type="spellEnd"/>
+      <w:r>
+        <w:t xml:space="preserve"> browser, ed è oggi il modo raccomandato di far dialogare una applicazione Angular con dei servizi protetti.</w:t>
       </w:r>
     </w:p>
     <w:p>
@@ -14224,7 +14484,91 @@
         <w:jc w:val="both"/>
       </w:pPr>
       <w:r>
-        <w:t>Non è un livello in più per gusto dell’architettura: risolve un problema che le applicazioni a pagina singola hanno per costruzione. Una pagina prodotta dal server ha una sessione lato server e il gettone non lascia mai la macchina; una applicazione che gira nel browser, se deve presentare un gettone, deve anche conservarlo da qualche parte — e ogni posto in cui può conservarlo è leggibile da chi riesca a far eseguire uno script nella pagina.</w:t>
+        <w:t xml:space="preserve">Non è un livello in più per gusto dell’architettura: risolve un problema che le applicazioni a pagina singola hanno per costruzione. Una pagina prodotta dal server ha una sessione lato server e il </w:t>
+      </w:r>
+      <w:r>
+        <w:t>token</w:t>
+      </w:r>
+      <w:r>
+        <w:t xml:space="preserve"> non </w:t>
+      </w:r>
+      <w:proofErr w:type="spellStart"/>
+      <w:r>
+        <w:t>lascia</w:t>
+      </w:r>
+      <w:proofErr w:type="spellEnd"/>
+      <w:r>
+        <w:t xml:space="preserve"> </w:t>
+      </w:r>
+      <w:proofErr w:type="spellStart"/>
+      <w:r>
+        <w:t>mai</w:t>
+      </w:r>
+      <w:proofErr w:type="spellEnd"/>
+      <w:r>
+        <w:t xml:space="preserve"> la </w:t>
+      </w:r>
+      <w:proofErr w:type="spellStart"/>
+      <w:r>
+        <w:t>macchina</w:t>
+      </w:r>
+      <w:proofErr w:type="spellEnd"/>
+      <w:r>
+        <w:t xml:space="preserve">; una applicazione che gira </w:t>
+      </w:r>
+      <w:proofErr w:type="spellStart"/>
+      <w:r>
+        <w:t>nel</w:t>
+      </w:r>
+      <w:proofErr w:type="spellEnd"/>
+      <w:r>
+        <w:t xml:space="preserve"> browser, se </w:t>
+      </w:r>
+      <w:proofErr w:type="spellStart"/>
+      <w:r>
+        <w:t>deve</w:t>
+      </w:r>
+      <w:proofErr w:type="spellEnd"/>
+      <w:r>
+        <w:t xml:space="preserve"> </w:t>
+      </w:r>
+      <w:proofErr w:type="spellStart"/>
+      <w:r>
+        <w:t>presentare</w:t>
+      </w:r>
+      <w:proofErr w:type="spellEnd"/>
+      <w:r>
+        <w:t xml:space="preserve"> un </w:t>
+      </w:r>
+      <w:r>
+        <w:t>token</w:t>
+      </w:r>
+      <w:r>
+        <w:t xml:space="preserve">, </w:t>
+      </w:r>
+      <w:proofErr w:type="spellStart"/>
+      <w:r>
+        <w:t>deve</w:t>
+      </w:r>
+      <w:proofErr w:type="spellEnd"/>
+      <w:r>
+        <w:t xml:space="preserve"> </w:t>
+      </w:r>
+      <w:proofErr w:type="spellStart"/>
+      <w:r>
+        <w:t>anche</w:t>
+      </w:r>
+      <w:proofErr w:type="spellEnd"/>
+      <w:r>
+        <w:t xml:space="preserve"> </w:t>
+      </w:r>
+      <w:proofErr w:type="spellStart"/>
+      <w:r>
+        <w:t>conservarlo</w:t>
+      </w:r>
+      <w:proofErr w:type="spellEnd"/>
+      <w:r>
+        <w:t xml:space="preserve"> da qualche parte — e ogni posto in cui può conservarlo è leggibile da chi riesca a far eseguire uno script nella pagina.</w:t>
       </w:r>
     </w:p>
     <w:p>
@@ -14338,7 +14682,47 @@
               <w:rPr>
                 <w:sz w:val="18"/>
               </w:rPr>
-              <w:t>Il gettone sta nel browser</w:t>
+              <w:t xml:space="preserve">Il </w:t>
+            </w:r>
+            <w:r>
+              <w:rPr>
+                <w:sz w:val="18"/>
+              </w:rPr>
+              <w:t>token</w:t>
+            </w:r>
+            <w:r>
+              <w:rPr>
+                <w:sz w:val="18"/>
+              </w:rPr>
+              <w:t xml:space="preserve"> </w:t>
+            </w:r>
+            <w:proofErr w:type="spellStart"/>
+            <w:r>
+              <w:rPr>
+                <w:sz w:val="18"/>
+              </w:rPr>
+              <w:t>sta</w:t>
+            </w:r>
+            <w:proofErr w:type="spellEnd"/>
+            <w:r>
+              <w:rPr>
+                <w:sz w:val="18"/>
+              </w:rPr>
+              <w:t xml:space="preserve"> </w:t>
+            </w:r>
+            <w:proofErr w:type="spellStart"/>
+            <w:r>
+              <w:rPr>
+                <w:sz w:val="18"/>
+              </w:rPr>
+              <w:t>nel</w:t>
+            </w:r>
+            <w:proofErr w:type="spellEnd"/>
+            <w:r>
+              <w:rPr>
+                <w:sz w:val="18"/>
+              </w:rPr>
+              <w:t xml:space="preserve"> browser</w:t>
             </w:r>
           </w:p>
         </w:tc>
@@ -14374,7 +14758,75 @@
               <w:rPr>
                 <w:sz w:val="18"/>
               </w:rPr>
-              <w:t xml:space="preserve">Oggi le applicazioni Angular conservano il gettone in localStorage, dove è leggibile da qualunque script che riesca </w:t>
+              <w:t xml:space="preserve">Oggi le </w:t>
+            </w:r>
+            <w:proofErr w:type="spellStart"/>
+            <w:r>
+              <w:rPr>
+                <w:sz w:val="18"/>
+              </w:rPr>
+              <w:t>applicazioni</w:t>
+            </w:r>
+            <w:proofErr w:type="spellEnd"/>
+            <w:r>
+              <w:rPr>
+                <w:sz w:val="18"/>
+              </w:rPr>
+              <w:t xml:space="preserve"> Angular </w:t>
+            </w:r>
+            <w:proofErr w:type="spellStart"/>
+            <w:r>
+              <w:rPr>
+                <w:sz w:val="18"/>
+              </w:rPr>
+              <w:t>conservano</w:t>
+            </w:r>
+            <w:proofErr w:type="spellEnd"/>
+            <w:r>
+              <w:rPr>
+                <w:sz w:val="18"/>
+              </w:rPr>
+              <w:t xml:space="preserve"> il </w:t>
+            </w:r>
+            <w:r>
+              <w:rPr>
+                <w:sz w:val="18"/>
+              </w:rPr>
+              <w:t>token</w:t>
+            </w:r>
+            <w:r>
+              <w:rPr>
+                <w:sz w:val="18"/>
+              </w:rPr>
+              <w:t xml:space="preserve"> in </w:t>
+            </w:r>
+            <w:proofErr w:type="spellStart"/>
+            <w:r>
+              <w:rPr>
+                <w:sz w:val="18"/>
+              </w:rPr>
+              <w:t>localStorage</w:t>
+            </w:r>
+            <w:proofErr w:type="spellEnd"/>
+            <w:r>
+              <w:rPr>
+                <w:sz w:val="18"/>
+              </w:rPr>
+              <w:t xml:space="preserve">, dove è </w:t>
+            </w:r>
+            <w:proofErr w:type="spellStart"/>
+            <w:r>
+              <w:rPr>
+                <w:sz w:val="18"/>
+              </w:rPr>
+              <w:t>leggibile</w:t>
+            </w:r>
+            <w:proofErr w:type="spellEnd"/>
+            <w:r>
+              <w:rPr>
+                <w:sz w:val="18"/>
+              </w:rPr>
+              <w:t xml:space="preserve"> da qualunque script che riesca </w:t>
             </w:r>
             <w:proofErr w:type="gramStart"/>
             <w:r>
@@ -14388,7 +14840,75 @@
               <w:rPr>
                 <w:sz w:val="18"/>
               </w:rPr>
-              <w:t xml:space="preserve"> eseguire nella pagina. Con un BFF il browser tiene solo un cookie di sessione e il gettone non lo raggiunge mai. È un </w:t>
+              <w:t xml:space="preserve"> eseguire nella pagina. Con </w:t>
+            </w:r>
+            <w:proofErr w:type="gramStart"/>
+            <w:r>
+              <w:rPr>
+                <w:sz w:val="18"/>
+              </w:rPr>
+              <w:t>un BFF</w:t>
+            </w:r>
+            <w:proofErr w:type="gramEnd"/>
+            <w:r>
+              <w:rPr>
+                <w:sz w:val="18"/>
+              </w:rPr>
+              <w:t xml:space="preserve"> il browser tiene solo un cookie di </w:t>
+            </w:r>
+            <w:proofErr w:type="spellStart"/>
+            <w:r>
+              <w:rPr>
+                <w:sz w:val="18"/>
+              </w:rPr>
+              <w:t>sessione</w:t>
+            </w:r>
+            <w:proofErr w:type="spellEnd"/>
+            <w:r>
+              <w:rPr>
+                <w:sz w:val="18"/>
+              </w:rPr>
+              <w:t xml:space="preserve"> e il </w:t>
+            </w:r>
+            <w:r>
+              <w:rPr>
+                <w:sz w:val="18"/>
+              </w:rPr>
+              <w:t>token</w:t>
+            </w:r>
+            <w:r>
+              <w:rPr>
+                <w:sz w:val="18"/>
+              </w:rPr>
+              <w:t xml:space="preserve"> non lo </w:t>
+            </w:r>
+            <w:proofErr w:type="spellStart"/>
+            <w:r>
+              <w:rPr>
+                <w:sz w:val="18"/>
+              </w:rPr>
+              <w:t>raggiunge</w:t>
+            </w:r>
+            <w:proofErr w:type="spellEnd"/>
+            <w:r>
+              <w:rPr>
+                <w:sz w:val="18"/>
+              </w:rPr>
+              <w:t xml:space="preserve"> </w:t>
+            </w:r>
+            <w:proofErr w:type="spellStart"/>
+            <w:r>
+              <w:rPr>
+                <w:sz w:val="18"/>
+              </w:rPr>
+              <w:t>mai</w:t>
+            </w:r>
+            <w:proofErr w:type="spellEnd"/>
+            <w:r>
+              <w:rPr>
+                <w:sz w:val="18"/>
+              </w:rPr>
+              <w:t xml:space="preserve">. È un </w:t>
             </w:r>
             <w:proofErr w:type="spellStart"/>
             <w:r>
@@ -14466,7 +14986,103 @@
               <w:rPr>
                 <w:sz w:val="18"/>
               </w:rPr>
-              <w:t>Il BFF è il punto naturale in cui l’identità reale — dagli header oggi, dal gettone domani — si converte in qualcosa da propagare a valle. Non toglie ai servizi il lavoro di verificarla, ma lo localizza: un componente invece di trentacinque.</w:t>
+              <w:t xml:space="preserve">Il BFF è il punto naturale in cui l’identità reale — </w:t>
+            </w:r>
+            <w:proofErr w:type="spellStart"/>
+            <w:r>
+              <w:rPr>
+                <w:sz w:val="18"/>
+              </w:rPr>
+              <w:t>dagli</w:t>
+            </w:r>
+            <w:proofErr w:type="spellEnd"/>
+            <w:r>
+              <w:rPr>
+                <w:sz w:val="18"/>
+              </w:rPr>
+              <w:t xml:space="preserve"> header </w:t>
+            </w:r>
+            <w:proofErr w:type="spellStart"/>
+            <w:r>
+              <w:rPr>
+                <w:sz w:val="18"/>
+              </w:rPr>
+              <w:t>oggi</w:t>
+            </w:r>
+            <w:proofErr w:type="spellEnd"/>
+            <w:r>
+              <w:rPr>
+                <w:sz w:val="18"/>
+              </w:rPr>
+              <w:t xml:space="preserve">, dal </w:t>
+            </w:r>
+            <w:r>
+              <w:rPr>
+                <w:sz w:val="18"/>
+              </w:rPr>
+              <w:t>token</w:t>
+            </w:r>
+            <w:r>
+              <w:rPr>
+                <w:sz w:val="18"/>
+              </w:rPr>
+              <w:t xml:space="preserve"> </w:t>
+            </w:r>
+            <w:proofErr w:type="spellStart"/>
+            <w:r>
+              <w:rPr>
+                <w:sz w:val="18"/>
+              </w:rPr>
+              <w:t>domani</w:t>
+            </w:r>
+            <w:proofErr w:type="spellEnd"/>
+            <w:r>
+              <w:rPr>
+                <w:sz w:val="18"/>
+              </w:rPr>
+              <w:t xml:space="preserve"> — </w:t>
+            </w:r>
+            <w:proofErr w:type="spellStart"/>
+            <w:r>
+              <w:rPr>
+                <w:sz w:val="18"/>
+              </w:rPr>
+              <w:t>si</w:t>
+            </w:r>
+            <w:proofErr w:type="spellEnd"/>
+            <w:r>
+              <w:rPr>
+                <w:sz w:val="18"/>
+              </w:rPr>
+              <w:t xml:space="preserve"> </w:t>
+            </w:r>
+            <w:proofErr w:type="spellStart"/>
+            <w:r>
+              <w:rPr>
+                <w:sz w:val="18"/>
+              </w:rPr>
+              <w:t>converte</w:t>
+            </w:r>
+            <w:proofErr w:type="spellEnd"/>
+            <w:r>
+              <w:rPr>
+                <w:sz w:val="18"/>
+              </w:rPr>
+              <w:t xml:space="preserve"> in </w:t>
+            </w:r>
+            <w:proofErr w:type="spellStart"/>
+            <w:r>
+              <w:rPr>
+                <w:sz w:val="18"/>
+              </w:rPr>
+              <w:t>qualcosa</w:t>
+            </w:r>
+            <w:proofErr w:type="spellEnd"/>
+            <w:r>
+              <w:rPr>
+                <w:sz w:val="18"/>
+              </w:rPr>
+              <w:t xml:space="preserve"> da propagare a valle. Non toglie ai servizi il lavoro di verificarla, ma lo localizza: un componente invece di trentacinque.</w:t>
             </w:r>
           </w:p>
         </w:tc>
@@ -14530,7 +15146,21 @@
               <w:rPr>
                 <w:sz w:val="18"/>
               </w:rPr>
-              <w:t xml:space="preserve"> Angular non sono in attesa di essere collegate — hanno già una via di accesso che gli header non li usa. Costruire un BFF perché possano usarli sarebbe un passo indietro.</w:t>
+              <w:t xml:space="preserve"> Angular non </w:t>
+            </w:r>
+            <w:proofErr w:type="spellStart"/>
+            <w:r>
+              <w:rPr>
+                <w:sz w:val="18"/>
+              </w:rPr>
+              <w:t>sono</w:t>
+            </w:r>
+            <w:proofErr w:type="spellEnd"/>
+            <w:r>
+              <w:rPr>
+                <w:sz w:val="18"/>
+              </w:rPr>
+              <w:t xml:space="preserve"> in attesa di essere collegate — hanno già una via di accesso che gli header non li usa. Costruire un BFF perché possano usarli sarebbe un passo indietro.</w:t>
             </w:r>
           </w:p>
         </w:tc>
@@ -14660,7 +15290,15 @@
       </w:r>
       <w:proofErr w:type="spellEnd"/>
       <w:r>
-        <w:t xml:space="preserve"> header come appoggio temporaneo. È anche il solo modo di cominciare a costruire prima che D1-D6 siano decise, perché il componente non cambia fra le due modalità — cambia soltanto da dove prende l’identità. La proprietà di commutazione fra le due modalità, prevista dalla decisione D6, troverebbe lì la sua casa naturale.</w:t>
+        <w:t xml:space="preserve"> header come </w:t>
+      </w:r>
+      <w:proofErr w:type="spellStart"/>
+      <w:r>
+        <w:t>appoggio</w:t>
+      </w:r>
+      <w:proofErr w:type="spellEnd"/>
+      <w:r>
+        <w:t xml:space="preserve"> temporaneo. È anche il solo modo di cominciare a costruire prima che D1-D6 siano decise, perché il componente non cambia fra le due modalità — cambia soltanto da dove prende l’identità. La proprietà di commutazione fra le due modalità, prevista dalla decisione D6, troverebbe lì la sua casa naturale.</w:t>
       </w:r>
     </w:p>
     <w:p>
@@ -14669,10 +15307,7 @@
       </w:pPr>
       <w:r>
         <w:lastRenderedPageBreak/>
-        <w:t>I</w:t>
-      </w:r>
-      <w:r>
-        <w:t xml:space="preserve">l BFF </w:t>
+        <w:t xml:space="preserve">Il BFF </w:t>
       </w:r>
       <w:proofErr w:type="spellStart"/>
       <w:r>
@@ -14688,7 +15323,15 @@
       </w:r>
       <w:proofErr w:type="spellEnd"/>
       <w:r>
-        <w:t xml:space="preserve"> con l’interfaccia che separa «costruisci il reindirizzamento» da «gestisci il ritorno». Senza, commutarlo da header a OIDC costa quanto riscriverlo, e la variante perde la sua unica ragione.</w:t>
+        <w:t xml:space="preserve"> con </w:t>
+      </w:r>
+      <w:proofErr w:type="spellStart"/>
+      <w:r>
+        <w:t>l’interfaccia</w:t>
+      </w:r>
+      <w:proofErr w:type="spellEnd"/>
+      <w:r>
+        <w:t xml:space="preserve"> che separa «costruisci il reindirizzamento» da «gestisci il ritorno». Senza, commutarlo da header a OIDC costa quanto riscriverlo, e la variante perde la sua unica ragione.</w:t>
       </w:r>
     </w:p>
     <w:p>
@@ -14739,7 +15382,23 @@
         <w:jc w:val="both"/>
       </w:pPr>
       <w:r>
-        <w:t xml:space="preserve">Una conseguenza operativa </w:t>
+        <w:t xml:space="preserve">Una </w:t>
+      </w:r>
+      <w:proofErr w:type="spellStart"/>
+      <w:r>
+        <w:t>conseguenza</w:t>
+      </w:r>
+      <w:proofErr w:type="spellEnd"/>
+      <w:r>
+        <w:t xml:space="preserve"> </w:t>
+      </w:r>
+      <w:proofErr w:type="spellStart"/>
+      <w:r>
+        <w:t>operativa</w:t>
+      </w:r>
+      <w:proofErr w:type="spellEnd"/>
+      <w:r>
+        <w:t xml:space="preserve"> </w:t>
       </w:r>
       <w:r>
         <w:t xml:space="preserve">è </w:t>
@@ -14756,13 +15415,27 @@
         <w:rPr>
           <w:bCs/>
         </w:rPr>
-        <w:t xml:space="preserve">il BFF tiene </w:t>
+        <w:t xml:space="preserve">il BFF </w:t>
       </w:r>
       <w:proofErr w:type="spellStart"/>
       <w:r>
         <w:rPr>
           <w:bCs/>
         </w:rPr>
+        <w:t>tiene</w:t>
+      </w:r>
+      <w:proofErr w:type="spellEnd"/>
+      <w:r>
+        <w:rPr>
+          <w:bCs/>
+        </w:rPr>
+        <w:t xml:space="preserve"> </w:t>
+      </w:r>
+      <w:proofErr w:type="spellStart"/>
+      <w:r>
+        <w:rPr>
+          <w:bCs/>
+        </w:rPr>
         <w:t>può</w:t>
       </w:r>
       <w:proofErr w:type="spellEnd"/>
@@ -14784,13 +15457,49 @@
         <w:rPr>
           <w:bCs/>
         </w:rPr>
-        <w:t xml:space="preserve"> la</w:t>
-      </w:r>
+        <w:t xml:space="preserve"> </w:t>
+      </w:r>
+      <w:proofErr w:type="spellStart"/>
       <w:r>
         <w:rPr>
           <w:bCs/>
         </w:rPr>
-        <w:t xml:space="preserve"> sessione, quindi non è senza stato</w:t>
+        <w:t>una</w:t>
+      </w:r>
+      <w:proofErr w:type="spellEnd"/>
+      <w:r>
+        <w:rPr>
+          <w:bCs/>
+        </w:rPr>
+        <w:t xml:space="preserve"> </w:t>
+      </w:r>
+      <w:proofErr w:type="spellStart"/>
+      <w:r>
+        <w:rPr>
+          <w:bCs/>
+        </w:rPr>
+        <w:t>sessione</w:t>
+      </w:r>
+      <w:proofErr w:type="spellEnd"/>
+      <w:r>
+        <w:rPr>
+          <w:bCs/>
+        </w:rPr>
+        <w:t xml:space="preserve">, </w:t>
+      </w:r>
+      <w:proofErr w:type="spellStart"/>
+      <w:r>
+        <w:rPr>
+          <w:bCs/>
+        </w:rPr>
+        <w:t>quindi</w:t>
+      </w:r>
+      <w:proofErr w:type="spellEnd"/>
+      <w:r>
+        <w:rPr>
+          <w:bCs/>
+        </w:rPr>
+        <w:t xml:space="preserve"> non è senza stato</w:t>
       </w:r>
       <w:r>
         <w:rPr>
@@ -14815,7 +15524,15 @@
       </w:r>
       <w:proofErr w:type="spellEnd"/>
       <w:r>
-        <w:t xml:space="preserve"> che il rilievo RI-19 segnala oggi per i front-end — sessione in memoria, nessun archivio condiviso — e la variante è l’occasione per risolverlo invece di ereditarlo. Vale infine, come per il gateway, che la sonda di prontezza non deve dipendere dalla raggiungibilità di IAM: un disservizio esterno non deve far riavviare il componente.</w:t>
+        <w:t xml:space="preserve"> </w:t>
+      </w:r>
+      <w:proofErr w:type="spellStart"/>
+      <w:r>
+        <w:t>che</w:t>
+      </w:r>
+      <w:proofErr w:type="spellEnd"/>
+      <w:r>
+        <w:t xml:space="preserve"> il rilievo RI-19 segnala oggi per i front-end — sessione in memoria, nessun archivio condiviso — e la variante è l’occasione per risolverlo invece di ereditarlo. Vale infine, come per il gateway, che la sonda di prontezza non deve dipendere dalla raggiungibilità di IAM: un disservizio esterno non deve far riavviare il componente.</w:t>
       </w:r>
     </w:p>
     <w:p>
@@ -14858,7 +15575,19 @@
         <w:rPr>
           <w:lang w:val="it-IT"/>
         </w:rPr>
-        <w:t xml:space="preserve">. La libreria Angular condivisa dell’ente, in assenza di gettone, rinvia a </w:t>
+        <w:t xml:space="preserve">. La libreria Angular condivisa dell’ente, in assenza di </w:t>
+      </w:r>
+      <w:r>
+        <w:rPr>
+          <w:lang w:val="it-IT"/>
+        </w:rPr>
+        <w:t>token</w:t>
+      </w:r>
+      <w:r>
+        <w:rPr>
+          <w:lang w:val="it-IT"/>
+        </w:rPr>
+        <w:t xml:space="preserve">, rinvia a </w:t>
       </w:r>
       <w:r>
         <w:rPr>
@@ -14953,7 +15682,19 @@
         <w:rPr>
           <w:lang w:val="it-IT"/>
         </w:rPr>
-        <w:t xml:space="preserve">n componente centrale che fa da interlocutore verso IAM ed emette alle applicazioni un proprio gettone con claim applicativi: è esattamente il ruolo dell’opzione C. Se così fosse, la decisione D1 </w:t>
+        <w:t xml:space="preserve">n componente centrale che fa da interlocutore verso IAM ed emette alle applicazioni un proprio </w:t>
+      </w:r>
+      <w:r>
+        <w:rPr>
+          <w:lang w:val="it-IT"/>
+        </w:rPr>
+        <w:t>token</w:t>
+      </w:r>
+      <w:r>
+        <w:rPr>
+          <w:lang w:val="it-IT"/>
+        </w:rPr>
+        <w:t xml:space="preserve"> con claim applicativi: è esattamente il ruolo dell’opzione C. Se così fosse, la decisione D1 </w:t>
       </w:r>
       <w:proofErr w:type="gramStart"/>
       <w:r>
@@ -15078,7 +15819,21 @@
                 <w:sz w:val="18"/>
                 <w:lang w:val="it-IT"/>
               </w:rPr>
-              <w:t>Tre incognite decidono se la strada regge e nessuna è verificabile dal lato client: copre anche i dipendenti o solo i cittadini? il suo gettone può portare ruoli, aree e funzionalità con la granularità di SIPO? è spendibile verso i back-end?</w:t>
+              <w:t xml:space="preserve">Tre incognite decidono se la strada regge e nessuna è verificabile dal lato client: copre anche i dipendenti o solo i cittadini? il suo </w:t>
+            </w:r>
+            <w:r>
+              <w:rPr>
+                <w:sz w:val="18"/>
+                <w:lang w:val="it-IT"/>
+              </w:rPr>
+              <w:t>token</w:t>
+            </w:r>
+            <w:r>
+              <w:rPr>
+                <w:sz w:val="18"/>
+                <w:lang w:val="it-IT"/>
+              </w:rPr>
+              <w:t xml:space="preserve"> può portare ruoli, aree e funzionalità con la granularità di SIPO? è spendibile verso i back-end?</w:t>
             </w:r>
           </w:p>
         </w:tc>
@@ -16907,7 +17662,21 @@
                 <w:sz w:val="17"/>
                 <w:lang w:val="it-IT"/>
               </w:rPr>
-              <w:t>L’identità diventa un gettone firmato che si verifica, non un header che si accoglie.</w:t>
+              <w:t xml:space="preserve">L’identità diventa un </w:t>
+            </w:r>
+            <w:r>
+              <w:rPr>
+                <w:sz w:val="17"/>
+                <w:lang w:val="it-IT"/>
+              </w:rPr>
+              <w:t>token</w:t>
+            </w:r>
+            <w:r>
+              <w:rPr>
+                <w:sz w:val="17"/>
+                <w:lang w:val="it-IT"/>
+              </w:rPr>
+              <w:t xml:space="preserve"> firmato che si verifica, non un header che si accoglie.</w:t>
             </w:r>
           </w:p>
         </w:tc>
@@ -17158,7 +17927,21 @@
                 <w:sz w:val="17"/>
                 <w:lang w:val="it-IT"/>
               </w:rPr>
-              <w:t>Richiede un gettone che rappresenti la persona e non l’utenza tecnica.</w:t>
+              <w:t xml:space="preserve">Richiede un </w:t>
+            </w:r>
+            <w:r>
+              <w:rPr>
+                <w:sz w:val="17"/>
+                <w:lang w:val="it-IT"/>
+              </w:rPr>
+              <w:t>token</w:t>
+            </w:r>
+            <w:r>
+              <w:rPr>
+                <w:sz w:val="17"/>
+                <w:lang w:val="it-IT"/>
+              </w:rPr>
+              <w:t xml:space="preserve"> che rappresenti la persona e non l’utenza tecnica.</w:t>
             </w:r>
           </w:p>
         </w:tc>
@@ -17220,7 +18003,21 @@
                 <w:sz w:val="17"/>
                 <w:lang w:val="it-IT"/>
               </w:rPr>
-              <w:t>Il gettone può portare tutti i ruoli; oggi la scelta è forzata dal meccanismo.</w:t>
+              <w:t xml:space="preserve">Il </w:t>
+            </w:r>
+            <w:r>
+              <w:rPr>
+                <w:sz w:val="17"/>
+                <w:lang w:val="it-IT"/>
+              </w:rPr>
+              <w:t>token</w:t>
+            </w:r>
+            <w:r>
+              <w:rPr>
+                <w:sz w:val="17"/>
+                <w:lang w:val="it-IT"/>
+              </w:rPr>
+              <w:t xml:space="preserve"> può portare tutti i ruoli; oggi la scelta è forzata dal meccanismo.</w:t>
             </w:r>
           </w:p>
         </w:tc>
@@ -18252,7 +19049,28 @@
                 <w:sz w:val="17"/>
                 <w:lang w:val="it-IT"/>
               </w:rPr>
-              <w:t>Seconda fase: gettone dell’utente, conservazione, solo server di risorsa, identità letta dal gettone</w:t>
+              <w:t xml:space="preserve">Seconda fase: </w:t>
+            </w:r>
+            <w:r>
+              <w:rPr>
+                <w:sz w:val="17"/>
+                <w:lang w:val="it-IT"/>
+              </w:rPr>
+              <w:t>token</w:t>
+            </w:r>
+            <w:r>
+              <w:rPr>
+                <w:sz w:val="17"/>
+                <w:lang w:val="it-IT"/>
+              </w:rPr>
+              <w:t xml:space="preserve"> dell’utente, conservazione, solo server di risorsa, identità letta dal </w:t>
+            </w:r>
+            <w:r>
+              <w:rPr>
+                <w:sz w:val="17"/>
+                <w:lang w:val="it-IT"/>
+              </w:rPr>
+              <w:t>token</w:t>
             </w:r>
           </w:p>
         </w:tc>
@@ -20610,7 +21428,51 @@
                 <w:sz w:val="18"/>
                 <w:lang w:val="it-IT"/>
               </w:rPr>
-              <w:t>Se le nuove applicazioni Angular debbano adottare un BFF, e con quale granularità. ⚠️ Oggi conservano il gettone in localStorage e chiamano i servizi direttamente: la scelta riguarda la loro architettura, non solo l’integrazione con IAM, e conviene prenderla prima che le applicazioni si moltiplichino.</w:t>
+              <w:t xml:space="preserve">Se le nuove applicazioni Angular debbano adottare un BFF, e con quale granularità. Oggi il </w:t>
+            </w:r>
+            <w:r>
+              <w:rPr>
+                <w:sz w:val="18"/>
+                <w:lang w:val="it-IT"/>
+              </w:rPr>
+              <w:t>token è conservato</w:t>
+            </w:r>
+            <w:r>
+              <w:rPr>
+                <w:sz w:val="18"/>
+                <w:lang w:val="it-IT"/>
+              </w:rPr>
+              <w:t xml:space="preserve"> in </w:t>
+            </w:r>
+            <w:proofErr w:type="spellStart"/>
+            <w:r>
+              <w:rPr>
+                <w:sz w:val="18"/>
+                <w:lang w:val="it-IT"/>
+              </w:rPr>
+              <w:t>localStorage</w:t>
+            </w:r>
+            <w:proofErr w:type="spellEnd"/>
+            <w:r>
+              <w:rPr>
+                <w:sz w:val="18"/>
+                <w:lang w:val="it-IT"/>
+              </w:rPr>
+              <w:t xml:space="preserve"> e i servizi</w:t>
+            </w:r>
+            <w:r>
+              <w:rPr>
+                <w:sz w:val="18"/>
+                <w:lang w:val="it-IT"/>
+              </w:rPr>
+              <w:t xml:space="preserve"> sono chiamati</w:t>
+            </w:r>
+            <w:r>
+              <w:rPr>
+                <w:sz w:val="18"/>
+                <w:lang w:val="it-IT"/>
+              </w:rPr>
+              <w:t xml:space="preserve"> direttamente: la scelta riguarda la loro architettura, non solo l’integrazione con IAM, e conviene prenderla prima che le applicazioni si moltiplichino.</w:t>
             </w:r>
           </w:p>
         </w:tc>
@@ -20637,6 +21499,42 @@
         </w:tc>
       </w:tr>
     </w:tbl>
+    <w:p>
+      <w:pPr>
+        <w:jc w:val="both"/>
+        <w:rPr>
+          <w:lang w:val="it-IT"/>
+        </w:rPr>
+      </w:pPr>
+    </w:p>
+    <w:p>
+      <w:pPr>
+        <w:rPr>
+          <w:lang w:val="it-IT"/>
+        </w:rPr>
+      </w:pPr>
+      <w:r>
+        <w:rPr>
+          <w:lang w:val="it-IT"/>
+        </w:rPr>
+        <w:br w:type="page"/>
+      </w:r>
+    </w:p>
+    <w:p>
+      <w:pPr>
+        <w:pStyle w:val="Titolo1"/>
+        <w:rPr>
+          <w:lang w:val="it-IT"/>
+        </w:rPr>
+      </w:pPr>
+      <w:r>
+        <w:rPr>
+          <w:lang w:val="it-IT"/>
+        </w:rPr>
+        <w:lastRenderedPageBreak/>
+        <w:t>Scelte effettuate</w:t>
+      </w:r>
+    </w:p>
     <w:p>
       <w:pPr>
         <w:jc w:val="both"/>
@@ -23887,16 +24785,12 @@
 </file>
 
 <file path=customXml/item1.xml><?xml version="1.0" encoding="utf-8"?>
-<b:Sources xmlns:b="http://schemas.openxmlformats.org/officeDocument/2006/bibliography" xmlns="http://schemas.openxmlformats.org/officeDocument/2006/bibliography" SelectedStyle="\APASixthEditionOfficeOnline.xsl" StyleName="APA" Version="6"/>
-</file>
-
-<file path=customXml/item2.xml><?xml version="1.0" encoding="utf-8"?>
 <p:properties xmlns:p="http://schemas.microsoft.com/office/2006/metadata/properties" xmlns:xsi="http://www.w3.org/2001/XMLSchema-instance" xmlns:pc="http://schemas.microsoft.com/office/infopath/2007/PartnerControls">
   <documentManagement/>
 </p:properties>
 </file>
 
-<file path=customXml/item3.xml><?xml version="1.0" encoding="utf-8"?>
+<file path=customXml/item2.xml><?xml version="1.0" encoding="utf-8"?>
 <ct:contentTypeSchema xmlns:ct="http://schemas.microsoft.com/office/2006/metadata/contentType" xmlns:ma="http://schemas.microsoft.com/office/2006/metadata/properties/metaAttributes" ct:_="" ma:_="" ma:contentTypeName="Documento" ma:contentTypeID="0x0101000F70AD27AC816949BF7C819E6DFFF475" ma:contentTypeVersion="7" ma:contentTypeDescription="Creare un nuovo documento." ma:contentTypeScope="" ma:versionID="a3c63e874e08f7b0b0412d3283f410be">
   <xsd:schema xmlns:xsd="http://www.w3.org/2001/XMLSchema" xmlns:xs="http://www.w3.org/2001/XMLSchema" xmlns:p="http://schemas.microsoft.com/office/2006/metadata/properties" xmlns:ns2="320850a0-50f7-4a29-83a2-c11c7ba2e4a4" targetNamespace="http://schemas.microsoft.com/office/2006/metadata/properties" ma:root="true" ma:fieldsID="37eddf013746b268a4a345f63c84cd04" ns2:_="">
     <xsd:import namespace="320850a0-50f7-4a29-83a2-c11c7ba2e4a4"/>
@@ -24058,7 +24952,7 @@
 </ct:contentTypeSchema>
 </file>
 
-<file path=customXml/item4.xml><?xml version="1.0" encoding="utf-8"?>
+<file path=customXml/item3.xml><?xml version="1.0" encoding="utf-8"?>
 <?mso-contentType ?>
 <FormTemplates xmlns="http://schemas.microsoft.com/sharepoint/v3/contenttype/forms">
   <Display>DocumentLibraryForm</Display>
@@ -24067,15 +24961,11 @@
 </FormTemplates>
 </file>
 
-<file path=customXml/itemProps1.xml><?xml version="1.0" encoding="utf-8"?>
-<ds:datastoreItem xmlns:ds="http://schemas.openxmlformats.org/officeDocument/2006/customXml" ds:itemID="{BC6D8BCE-58E4-46C3-BADD-1867298A33AD}">
-  <ds:schemaRefs>
-    <ds:schemaRef ds:uri="http://schemas.openxmlformats.org/officeDocument/2006/bibliography"/>
-  </ds:schemaRefs>
-</ds:datastoreItem>
+<file path=customXml/item4.xml><?xml version="1.0" encoding="utf-8"?>
+<b:Sources xmlns:b="http://schemas.openxmlformats.org/officeDocument/2006/bibliography" xmlns="http://schemas.openxmlformats.org/officeDocument/2006/bibliography" SelectedStyle="\APASixthEditionOfficeOnline.xsl" StyleName="APA" Version="6"/>
 </file>
 
-<file path=customXml/itemProps2.xml><?xml version="1.0" encoding="utf-8"?>
+<file path=customXml/itemProps1.xml><?xml version="1.0" encoding="utf-8"?>
 <ds:datastoreItem xmlns:ds="http://schemas.openxmlformats.org/officeDocument/2006/customXml" ds:itemID="{DE4C094D-D12A-45EF-90D1-D76D17B6E427}">
   <ds:schemaRefs>
     <ds:schemaRef ds:uri="http://schemas.microsoft.com/office/2006/metadata/properties"/>
@@ -24084,7 +24974,7 @@
 </ds:datastoreItem>
 </file>
 
-<file path=customXml/itemProps3.xml><?xml version="1.0" encoding="utf-8"?>
+<file path=customXml/itemProps2.xml><?xml version="1.0" encoding="utf-8"?>
 <ds:datastoreItem xmlns:ds="http://schemas.openxmlformats.org/officeDocument/2006/customXml" ds:itemID="{B3715E09-15E7-413A-9BF3-994B1F4DCEA0}">
   <ds:schemaRefs>
     <ds:schemaRef ds:uri="http://schemas.microsoft.com/office/2006/metadata/contentType"/>
@@ -24102,10 +24992,18 @@
 </ds:datastoreItem>
 </file>
 
-<file path=customXml/itemProps4.xml><?xml version="1.0" encoding="utf-8"?>
+<file path=customXml/itemProps3.xml><?xml version="1.0" encoding="utf-8"?>
 <ds:datastoreItem xmlns:ds="http://schemas.openxmlformats.org/officeDocument/2006/customXml" ds:itemID="{F99C4A69-2199-4F0E-B095-005F11429EED}">
   <ds:schemaRefs>
     <ds:schemaRef ds:uri="http://schemas.microsoft.com/sharepoint/v3/contenttype/forms"/>
+  </ds:schemaRefs>
+</ds:datastoreItem>
+</file>
+
+<file path=customXml/itemProps4.xml><?xml version="1.0" encoding="utf-8"?>
+<ds:datastoreItem xmlns:ds="http://schemas.openxmlformats.org/officeDocument/2006/customXml" ds:itemID="{BC6D8BCE-58E4-46C3-BADD-1867298A33AD}">
+  <ds:schemaRefs>
+    <ds:schemaRef ds:uri="http://schemas.openxmlformats.org/officeDocument/2006/bibliography"/>
   </ds:schemaRefs>
 </ds:datastoreItem>
 </file>

</xml_diff>